<commit_message>
docs: 보고서 그림 배별 분리 — thruster_layout_A/B, hull_plan_A/B, hull_topmap_A/B
- tools/thruster_layout.py: draw_A/draw_B 로 분리, 전체 그림(기존 파일명) + 배별 thruster_layout_A.png(1번배 2기) / _B.png(2번배 4기 가·나·다) 저장
- tools/split_hull_figs.py (신규): STL 기반 hull_plan.png·hull_topmap.png 를 위(1번배)/아래(2번배)로 잘라 *_A/_B 저장 (원본 생성기는 저장소 밖)
- 생성기: Ⅱ-3.1 선형 = hull_topmap_{배}, Ⅱ-3.3 = thruster_layout_{배}, Ⅳ-5 배치도 = hull_plan_{배}. 2번배 hull_plan 은 STL 설계치(170×40)라 캡션에 실측 갱신 필요 표시
- 두 배 공용 그림(회로도·플로우차트·노드 구조도)은 그대로

Co-Authored-By: Claude Fable 5.1 <noreply@anthropic.com>
</commit_message>
<xml_diff>
--- a/docs/전달용/KABOAT2026_보고서_양식_SSF_A.docx
+++ b/docs/전달용/KABOAT2026_보고서_양식_SSF_A.docx
@@ -3829,7 +3829,7 @@
       <w:r>
         <w:drawing>
           <wp:inline distT="0" distB="0" distL="0" distR="0">
-            <wp:extent cx="5334000" cy="3695700"/>
+            <wp:extent cx="5334000" cy="2000250"/>
             <wp:effectExtent t="0" r="0" b="0" l="0"/>
             <wp:docPr id="1" name=""/>
             <wp:cNvGraphicFramePr>
@@ -3854,7 +3854,7 @@
                   <pic:spPr bwMode="auto">
                     <a:xfrm>
                       <a:off x="0" y="0"/>
-                      <a:ext cx="5334000" cy="3695700"/>
+                      <a:ext cx="5334000" cy="2000250"/>
                     </a:xfrm>
                     <a:prstGeom prst="rect">
                       <a:avLst/>
@@ -3879,7 +3879,7 @@
           <w:sz w:val="18"/>
           <w:szCs w:val="18"/>
         </w:rPr>
-        <w:t xml:space="preserve">그림 Ⅱ-1 선체 평면 배치 개념(tools 생성, 치수는 설계값)</w:t>
+        <w:t xml:space="preserve">그림 Ⅱ-1 1번배 선형 — STL 위에서 본 표면 높이 (STL 1000 mm ×1.66)</w:t>
       </w:r>
     </w:p>
     <w:p>
@@ -4498,7 +4498,7 @@
       <w:r>
         <w:drawing>
           <wp:inline distT="0" distB="0" distL="0" distR="0">
-            <wp:extent cx="5334000" cy="5724525"/>
+            <wp:extent cx="5334000" cy="2428875"/>
             <wp:effectExtent t="0" r="0" b="0" l="0"/>
             <wp:docPr id="2" name=""/>
             <wp:cNvGraphicFramePr>
@@ -4523,7 +4523,7 @@
                   <pic:spPr bwMode="auto">
                     <a:xfrm>
                       <a:off x="0" y="0"/>
-                      <a:ext cx="5334000" cy="5724525"/>
+                      <a:ext cx="5334000" cy="2428875"/>
                     </a:xfrm>
                     <a:prstGeom prst="rect">
                       <a:avLst/>
@@ -4548,7 +4548,7 @@
           <w:sz w:val="18"/>
           <w:szCs w:val="18"/>
         </w:rPr>
-        <w:t xml:space="preserve">그림 Ⅱ-2 T200 배치 해석 (tools/thruster_layout.py)</w:t>
+        <w:t xml:space="preserve">그림 Ⅱ-2 1번배 T200 ×2 배치 해석 (tools/thruster_layout.py)</w:t>
       </w:r>
     </w:p>
     <w:p>
@@ -16093,7 +16093,7 @@
       <w:r>
         <w:drawing>
           <wp:inline distT="0" distB="0" distL="0" distR="0">
-            <wp:extent cx="5334000" cy="4000500"/>
+            <wp:extent cx="5334000" cy="1847850"/>
             <wp:effectExtent t="0" r="0" b="0" l="0"/>
             <wp:docPr id="6" name=""/>
             <wp:cNvGraphicFramePr>
@@ -16118,7 +16118,7 @@
                   <pic:spPr bwMode="auto">
                     <a:xfrm>
                       <a:off x="0" y="0"/>
-                      <a:ext cx="5334000" cy="4000500"/>
+                      <a:ext cx="5334000" cy="1847850"/>
                     </a:xfrm>
                     <a:prstGeom prst="rect">
                       <a:avLst/>
@@ -16143,7 +16143,7 @@
           <w:sz w:val="18"/>
           <w:szCs w:val="18"/>
         </w:rPr>
-        <w:t xml:space="preserve">그림 Ⅳ-2 갑판 배치 개념(hull_topmap)</w:t>
+        <w:t xml:space="preserve">그림 Ⅳ-2 1번배 갑판 배치 개념 — 방수박스·GPS·마스트·LiDAR·RC 수신기 (치수 설계값 166×55)</w:t>
       </w:r>
     </w:p>
     <w:p>

</xml_diff>

<commit_message>
docs(report): regenerate chapter III docx with 10-31 OAK results
Rebuilt software A/B, review A/B and main report A/B from the updated
통합_Ⅲ소프트웨어.md (fe20d6a, 550f9f3). Checked: figures Ⅲ-2 and Ⅲ-3
embed oak_hfov_check.png and oak_angle_check.png, no missing-file boxes,
figure numbers Ⅲ-1..Ⅲ-5 appear in order in all six files.

Co-Authored-By: Claude Opus 5.5 <noreply@anthropic.com>
</commit_message>
<xml_diff>
--- a/docs/전달용/KABOAT2026_보고서_양식_SSF_A.docx
+++ b/docs/전달용/KABOAT2026_보고서_양식_SSF_A.docx
@@ -8337,7 +8337,7 @@
                 <w:sz w:val="20"/>
                 <w:szCs w:val="20"/>
               </w:rPr>
-              <w:t xml:space="preserve">Luxonis OAK-1 PoE FF (고정초점, HFOV 69° 스펙)</w:t>
+              <w:t xml:space="preserve">Luxonis OAK-1 PoE FF (고정초점, HFOV 69° 스펙 · 640×360 실측 63.9°)</w:t>
             </w:r>
           </w:p>
         </w:tc>
@@ -8406,7 +8406,7 @@
                 <w:sz w:val="20"/>
                 <w:szCs w:val="20"/>
               </w:rPr>
-              <w:t xml:space="preserve">(camera_info 실측)만 바꾼다</w:t>
+              <w:t xml:space="preserve">(camera_info 실측)만 바꾼다. 10-31 1번배에서 연결·화각·각도를 실측했다(Ⅲ-6.2)</w:t>
             </w:r>
           </w:p>
         </w:tc>
@@ -9305,7 +9305,7 @@
           <w:sz w:val="20"/>
           <w:szCs w:val="20"/>
         </w:rPr>
-        <w:t xml:space="preserve">배별 장착값과 정북 정렬.</w:t>
+        <w:t xml:space="preserve">배별 장착값.</w:t>
       </w:r>
       <w:r>
         <w:rPr>
@@ -9393,71 +9393,7 @@
           <w:sz w:val="20"/>
           <w:szCs w:val="20"/>
         </w:rPr>
-        <w:t xml:space="preserve"> 를 정수로 적으면(yaw_mux 부팅 즉시 사망) 정적 테스트가 잡는다. 정렬은 배를 나침반으로 정북에 맞추고 </w:t>
-      </w:r>
-      <w:r>
-        <w:rPr>
-          <w:rFonts w:ascii="Consolas" w:cs="Consolas" w:eastAsia="Consolas" w:hAnsi="Consolas"/>
-          <w:sz w:val="18"/>
-          <w:szCs w:val="18"/>
-        </w:rPr>
-        <w:t xml:space="preserve">/imu/yaw</w:t>
-      </w:r>
-      <w:r>
-        <w:rPr>
-          <w:rFonts w:ascii="Malgun Gothic" w:cs="Malgun Gothic" w:eastAsia="Malgun Gothic" w:hAnsi="Malgun Gothic"/>
-          <w:sz w:val="20"/>
-          <w:szCs w:val="20"/>
-        </w:rPr>
-        <w:t xml:space="preserve"> 가 목표값을 읽을 때까지 </w:t>
-      </w:r>
-      <w:r>
-        <w:rPr>
-          <w:rFonts w:ascii="Consolas" w:cs="Consolas" w:eastAsia="Consolas" w:hAnsi="Consolas"/>
-          <w:sz w:val="18"/>
-          <w:szCs w:val="18"/>
-        </w:rPr>
-        <w:t xml:space="preserve">mount_offset_deg</w:t>
-      </w:r>
-      <w:r>
-        <w:rPr>
-          <w:rFonts w:ascii="Malgun Gothic" w:cs="Malgun Gothic" w:eastAsia="Malgun Gothic" w:hAnsi="Malgun Gothic"/>
-          <w:sz w:val="20"/>
-          <w:szCs w:val="20"/>
-        </w:rPr>
-        <w:t xml:space="preserve"> 를 조정한다. 자기 나침반은 자북을 가리키고 </w:t>
-      </w:r>
-      <w:r>
-        <w:rPr>
-          <w:rFonts w:ascii="Consolas" w:cs="Consolas" w:eastAsia="Consolas" w:hAnsi="Consolas"/>
-          <w:sz w:val="18"/>
-          <w:szCs w:val="18"/>
-        </w:rPr>
-        <w:t xml:space="preserve">imu_relative</w:t>
-      </w:r>
-      <w:r>
-        <w:rPr>
-          <w:rFonts w:ascii="Malgun Gothic" w:cs="Malgun Gothic" w:eastAsia="Malgun Gothic" w:hAnsi="Malgun Gothic"/>
-          <w:sz w:val="20"/>
-          <w:szCs w:val="20"/>
-        </w:rPr>
-        <w:t xml:space="preserve"> 는 편각을 쓰지 않으므로 목표값은 0 이 아니라 진북 기준 뱃머리 360 + 편각(한국 약 352)이다. 이어 시계방향 90° 회전에서 값이 증가하는지로 </w:t>
-      </w:r>
-      <w:r>
-        <w:rPr>
-          <w:rFonts w:ascii="Consolas" w:cs="Consolas" w:eastAsia="Consolas" w:hAnsi="Consolas"/>
-          <w:sz w:val="18"/>
-          <w:szCs w:val="18"/>
-        </w:rPr>
-        <w:t xml:space="preserve">invert_yaw</w:t>
-      </w:r>
-      <w:r>
-        <w:rPr>
-          <w:rFonts w:ascii="Malgun Gothic" w:cs="Malgun Gothic" w:eastAsia="Malgun Gothic" w:hAnsi="Malgun Gothic"/>
-          <w:sz w:val="20"/>
-          <w:szCs w:val="20"/>
-        </w:rPr>
-        <w:t xml:space="preserve"> 를 정한다.</w:t>
+        <w:t xml:space="preserve"> 를 정수로 적으면(yaw_mux 부팅 즉시 사망) 정적 테스트가 잡는다.</w:t>
       </w:r>
     </w:p>
     <w:tbl>
@@ -9865,7 +9801,23 @@
                 <w:sz w:val="20"/>
                 <w:szCs w:val="20"/>
               </w:rPr>
-              <w:t xml:space="preserve">배 조립 후 정북 정렬 절차로 정한다</w:t>
+              <w:t xml:space="preserve">배별 파일 </w:t>
+            </w:r>
+            <w:r>
+              <w:rPr>
+                <w:rFonts w:ascii="Consolas" w:cs="Consolas" w:eastAsia="Consolas" w:hAnsi="Consolas"/>
+                <w:sz w:val="18"/>
+                <w:szCs w:val="18"/>
+              </w:rPr>
+              <w:t xml:space="preserve">ssf_heading_A.yaml</w:t>
+            </w:r>
+            <w:r>
+              <w:rPr>
+                <w:rFonts w:ascii="Malgun Gothic" w:cs="Malgun Gothic" w:eastAsia="Malgun Gothic" w:hAnsi="Malgun Gothic"/>
+                <w:sz w:val="20"/>
+                <w:szCs w:val="20"/>
+              </w:rPr>
+              <w:t xml:space="preserve"> 에만 둔다</w:t>
             </w:r>
           </w:p>
         </w:tc>
@@ -12016,14 +11968,6 @@
       </w:pPr>
       <w:r>
         <w:rPr>
-          <w:rFonts w:ascii="Malgun Gothic" w:cs="Malgun Gothic" w:eastAsia="Malgun Gothic" w:hAnsi="Malgun Gothic"/>
-          <w:sz w:val="20"/>
-          <w:szCs w:val="20"/>
-        </w:rPr>
-        <w:t xml:space="preserve">LOS 이득은 초기값이며 물 위에서 튜닝한다. </w:t>
-      </w:r>
-      <w:r>
-        <w:rPr>
           <w:rFonts w:ascii="Consolas" w:cs="Consolas" w:eastAsia="Consolas" w:hAnsi="Consolas"/>
           <w:sz w:val="18"/>
           <w:szCs w:val="18"/>
@@ -14706,7 +14650,7 @@
                 <w:sz w:val="20"/>
                 <w:szCs w:val="20"/>
               </w:rPr>
-              <w:t xml:space="preserve">red [0-5]+[165-180], green H 60-85, white V≥220·S≤40 (실외에서 재조정)</w:t>
+              <w:t xml:space="preserve">red [0-5]+[165-180], green H 60-85, white V≥220·S≤40</w:t>
             </w:r>
           </w:p>
         </w:tc>
@@ -14789,7 +14733,7 @@
                 <w:sz w:val="20"/>
                 <w:szCs w:val="20"/>
               </w:rPr>
-              <w:t xml:space="preserve">min_area_px 40 (gate·turn) / 80 (dock), min_solidity 0.7, y_zone 검출기별 gate 0.15–0.55 / turn 0.10–0.55 / dock 0.15–0.55 (실측으로 조정)</w:t>
+              <w:t xml:space="preserve">min_area_px 40 (gate·turn) / 80 (dock), min_solidity 0.7, y_zone 검출기별 gate 0.15–0.55 / turn 0.10–0.55 / dock 0.15–0.55</w:t>
             </w:r>
           </w:p>
         </w:tc>
@@ -15038,7 +14982,7 @@
                 <w:sz w:val="20"/>
                 <w:szCs w:val="20"/>
               </w:rPr>
-              <w:t xml:space="preserve">hfov_deg 80.32 (D455 camera_info 실측) → OAK 스펙 69°, camera_info fx 로 교체한다</w:t>
+              <w:t xml:space="preserve">hfov_deg 80.32 (D455 camera_info 실측) → OAK 는 640×360 실측 63.9°(camera_info 63.87° 와 일치)로 교체한다</w:t>
             </w:r>
           </w:p>
         </w:tc>
@@ -15314,6 +15258,294 @@
           <w:szCs w:val="20"/>
         </w:rPr>
         <w:t xml:space="preserve"> 자율 비전은 OAK-1 PoE, 수동 조종 화면은 D455 로 역할을 나눈다. OAK-1 PoE 는 뎁스가 없지만 거리는 LiDAR 가 재고, D455 도 뎁스를 켜면 USB 에서 떨어져(2분간 13회) 끄고 쓰므로 잃는 기능이 없다. 진동에 강한 고정초점, HFOV 45° 인 32MP 대신 69° 표준형을 골랐다.</w:t>
+      </w:r>
+    </w:p>
+    <w:p>
+      <w:pPr>
+        <w:spacing w:after="60" w:line="290"/>
+        <w:ind w:left="360" w:hanging="240"/>
+      </w:pPr>
+      <w:r>
+        <w:rPr>
+          <w:rFonts w:ascii="Malgun Gothic" w:cs="Malgun Gothic" w:eastAsia="Malgun Gothic" w:hAnsi="Malgun Gothic"/>
+          <w:sz w:val="20"/>
+          <w:szCs w:val="20"/>
+        </w:rPr>
+        <w:t xml:space="preserve">•  </w:t>
+      </w:r>
+      <w:r>
+        <w:rPr>
+          <w:rFonts w:ascii="Malgun Gothic" w:cs="Malgun Gothic" w:eastAsia="Malgun Gothic" w:hAnsi="Malgun Gothic"/>
+          <w:b/>
+          <w:bCs/>
+          <w:sz w:val="20"/>
+          <w:szCs w:val="20"/>
+        </w:rPr>
+        <w:t xml:space="preserve">OAK 화각 실측(10-31, 1번배).</w:t>
+      </w:r>
+      <w:r>
+        <w:rPr>
+          <w:rFonts w:ascii="Malgun Gothic" w:cs="Malgun Gothic" w:eastAsia="Malgun Gothic" w:hAnsi="Malgun Gothic"/>
+          <w:sz w:val="20"/>
+          <w:szCs w:val="20"/>
+        </w:rPr>
+        <w:t xml:space="preserve"> 빨간 원 두 장(중심 간격 1.00 m)을 렌즈에서 2.40 m 떨어진 벽에 붙이고 60 프레임의 원 중심 간격 213.8 px(표준편차 0.27 px)으로 fx = 간격 × 거리 / 1.00 m 를 구해 </w:t>
+      </w:r>
+      <w:r>
+        <w:rPr>
+          <w:rFonts w:ascii="Malgun Gothic" w:cs="Malgun Gothic" w:eastAsia="Malgun Gothic" w:hAnsi="Malgun Gothic"/>
+          <w:b/>
+          <w:bCs/>
+          <w:sz w:val="20"/>
+          <w:szCs w:val="20"/>
+        </w:rPr>
+        <w:t xml:space="preserve">63.9°</w:t>
+      </w:r>
+      <w:r>
+        <w:rPr>
+          <w:rFonts w:ascii="Malgun Gothic" w:cs="Malgun Gothic" w:eastAsia="Malgun Gothic" w:hAnsi="Malgun Gothic"/>
+          <w:sz w:val="20"/>
+          <w:szCs w:val="20"/>
+        </w:rPr>
+        <w:t xml:space="preserve"> 를 얻었다. 카메라 공장 보정값(camera_info fx 513.5)에서 나온 63.87° 와 0.01° 차이다. 스펙 69° 는 4:3 센서 전체 값이고 1080P(16:9)는 가로도 일부 잘린다.</w:t>
+      </w:r>
+    </w:p>
+    <w:p>
+      <w:pPr>
+        <w:spacing w:after="60" w:line="290"/>
+        <w:ind w:left="360" w:hanging="240"/>
+      </w:pPr>
+      <w:r>
+        <w:rPr>
+          <w:rFonts w:ascii="Malgun Gothic" w:cs="Malgun Gothic" w:eastAsia="Malgun Gothic" w:hAnsi="Malgun Gothic"/>
+          <w:sz w:val="20"/>
+          <w:szCs w:val="20"/>
+        </w:rPr>
+        <w:t xml:space="preserve">•  </w:t>
+      </w:r>
+      <w:r>
+        <w:rPr>
+          <w:rFonts w:ascii="Malgun Gothic" w:cs="Malgun Gothic" w:eastAsia="Malgun Gothic" w:hAnsi="Malgun Gothic"/>
+          <w:b/>
+          <w:bCs/>
+          <w:sz w:val="20"/>
+          <w:szCs w:val="20"/>
+        </w:rPr>
+        <w:t xml:space="preserve">해상도 설정의 함정.</w:t>
+      </w:r>
+      <w:r>
+        <w:rPr>
+          <w:rFonts w:ascii="Malgun Gothic" w:cs="Malgun Gothic" w:eastAsia="Malgun Gothic" w:hAnsi="Malgun Gothic"/>
+          <w:sz w:val="20"/>
+          <w:szCs w:val="20"/>
+        </w:rPr>
+        <w:t xml:space="preserve"> 드라이버에 640×360 만 주면 1080P 를 2/3 로 줄인 1280×720 의 </w:t>
+      </w:r>
+      <w:r>
+        <w:rPr>
+          <w:rFonts w:ascii="Malgun Gothic" w:cs="Malgun Gothic" w:eastAsia="Malgun Gothic" w:hAnsi="Malgun Gothic"/>
+          <w:b/>
+          <w:bCs/>
+          <w:sz w:val="20"/>
+          <w:szCs w:val="20"/>
+        </w:rPr>
+        <w:t xml:space="preserve">가운데만 잘라</w:t>
+      </w:r>
+      <w:r>
+        <w:rPr>
+          <w:rFonts w:ascii="Malgun Gothic" w:cs="Malgun Gothic" w:eastAsia="Malgun Gothic" w:hAnsi="Malgun Gothic"/>
+          <w:sz w:val="20"/>
+          <w:szCs w:val="20"/>
+        </w:rPr>
+        <w:t xml:space="preserve"> 화각이 40.3° 가 된다(그림 Ⅲ-2 a). 그런데 camera_info 는 잘린 화면에서도 같은 fx 를 내므로 오류 없이 방위각이 틀린다. ISP 축소 비율 1/3 을 함께 줘 1080P 전체를 640×360 으로 줄인다(그림 Ⅲ-2 b).</w:t>
+      </w:r>
+    </w:p>
+    <w:p>
+      <w:pPr>
+        <w:spacing w:after="60" w:before="120"/>
+        <w:jc w:val="center"/>
+      </w:pPr>
+      <w:r>
+        <w:drawing>
+          <wp:inline distT="0" distB="0" distL="0" distR="0">
+            <wp:extent cx="5334000" cy="1752600"/>
+            <wp:effectExtent t="0" r="0" b="0" l="0"/>
+            <wp:docPr id="4" name=""/>
+            <wp:cNvGraphicFramePr>
+              <a:graphicFrameLocks xmlns:a="http://schemas.openxmlformats.org/drawingml/2006/main" noChangeAspect="1"/>
+            </wp:cNvGraphicFramePr>
+            <a:graphic xmlns:a="http://schemas.openxmlformats.org/drawingml/2006/main">
+              <a:graphicData uri="http://schemas.openxmlformats.org/drawingml/2006/picture">
+                <pic:pic xmlns:pic="http://schemas.openxmlformats.org/drawingml/2006/picture">
+                  <pic:nvPicPr>
+                    <pic:cNvPr id="0" name="" descr=""/>
+                    <pic:cNvPicPr>
+                      <a:picLocks noChangeAspect="1" noChangeArrowheads="1"/>
+                    </pic:cNvPicPr>
+                  </pic:nvPicPr>
+                  <pic:blipFill>
+                    <a:blip r:embed="rId10" cstate="none"/>
+                    <a:srcRect/>
+                    <a:stretch>
+                      <a:fillRect/>
+                    </a:stretch>
+                  </pic:blipFill>
+                  <pic:spPr bwMode="auto">
+                    <a:xfrm>
+                      <a:off x="0" y="0"/>
+                      <a:ext cx="5334000" cy="1752600"/>
+                    </a:xfrm>
+                    <a:prstGeom prst="rect">
+                      <a:avLst/>
+                    </a:prstGeom>
+                  </pic:spPr>
+                </pic:pic>
+              </a:graphicData>
+            </a:graphic>
+          </wp:inline>
+        </w:drawing>
+      </w:r>
+    </w:p>
+    <w:p>
+      <w:pPr>
+        <w:spacing w:after="160"/>
+        <w:jc w:val="center"/>
+      </w:pPr>
+      <w:r>
+        <w:rPr>
+          <w:rFonts w:ascii="Malgun Gothic" w:cs="Malgun Gothic" w:eastAsia="Malgun Gothic" w:hAnsi="Malgun Gothic"/>
+          <w:color w:val="555555"/>
+          <w:sz w:val="18"/>
+          <w:szCs w:val="18"/>
+        </w:rPr>
+        <w:t xml:space="preserve">그림 Ⅲ-2 OAK 화각 실측 — (a) 드라이버 기본 설정은 가운데만 잘려 40.3°, (b) ISP 1/3 전체 화면 63.9°</w:t>
+      </w:r>
+    </w:p>
+    <w:p>
+      <w:pPr>
+        <w:spacing w:after="60" w:line="290"/>
+        <w:ind w:left="360" w:hanging="240"/>
+      </w:pPr>
+      <w:r>
+        <w:rPr>
+          <w:rFonts w:ascii="Malgun Gothic" w:cs="Malgun Gothic" w:eastAsia="Malgun Gothic" w:hAnsi="Malgun Gothic"/>
+          <w:sz w:val="20"/>
+          <w:szCs w:val="20"/>
+        </w:rPr>
+        <w:t xml:space="preserve">•  </w:t>
+      </w:r>
+      <w:r>
+        <w:rPr>
+          <w:rFonts w:ascii="Malgun Gothic" w:cs="Malgun Gothic" w:eastAsia="Malgun Gothic" w:hAnsi="Malgun Gothic"/>
+          <w:b/>
+          <w:bCs/>
+          <w:sz w:val="20"/>
+          <w:szCs w:val="20"/>
+        </w:rPr>
+        <w:t xml:space="preserve">방위각 검증(10-31).</w:t>
+      </w:r>
+      <w:r>
+        <w:rPr>
+          <w:rFonts w:ascii="Malgun Gothic" w:cs="Malgun Gothic" w:eastAsia="Malgun Gothic" w:hAnsi="Malgun Gothic"/>
+          <w:sz w:val="20"/>
+          <w:szCs w:val="20"/>
+        </w:rPr>
+        <w:t xml:space="preserve"> 마스트 위 OAK 에서 벽까지 2.0 m, 게이트 검출기 </w:t>
+      </w:r>
+      <w:r>
+        <w:rPr>
+          <w:rFonts w:ascii="Consolas" w:cs="Consolas" w:eastAsia="Consolas" w:hAnsi="Consolas"/>
+          <w:sz w:val="18"/>
+          <w:szCs w:val="18"/>
+        </w:rPr>
+        <w:t xml:space="preserve">/red_angle</w:t>
+      </w:r>
+      <w:r>
+        <w:rPr>
+          <w:rFonts w:ascii="Malgun Gothic" w:cs="Malgun Gothic" w:eastAsia="Malgun Gothic" w:hAnsi="Malgun Gothic"/>
+          <w:sz w:val="20"/>
+          <w:szCs w:val="20"/>
+        </w:rPr>
+        <w:t xml:space="preserve"> 을 표식 위치별로 읽었다. 정중앙 +1.34°(흔들림 0.02°), 왼쪽 1.00 m +26.99°(기하 기대 +27.63°), 화면 왼쪽 끝 1.10 m +28.91°(기대 +29.83°)로 </w:t>
+      </w:r>
+      <w:r>
+        <w:rPr>
+          <w:rFonts w:ascii="Malgun Gothic" w:cs="Malgun Gothic" w:eastAsia="Malgun Gothic" w:hAnsi="Malgun Gothic"/>
+          <w:b/>
+          <w:bCs/>
+          <w:sz w:val="20"/>
+          <w:szCs w:val="20"/>
+        </w:rPr>
+        <w:t xml:space="preserve">왼쪽 = + 부호</w:t>
+      </w:r>
+      <w:r>
+        <w:rPr>
+          <w:rFonts w:ascii="Malgun Gothic" w:cs="Malgun Gothic" w:eastAsia="Malgun Gothic" w:hAnsi="Malgun Gothic"/>
+          <w:sz w:val="20"/>
+          <w:szCs w:val="20"/>
+        </w:rPr>
+        <w:t xml:space="preserve">가 맞고 오차는 1° 안이다. 렌즈 왜곡을 보정하지 않아 생기는 오차는 계산상 최대 약 1° 다.</w:t>
+      </w:r>
+    </w:p>
+    <w:p>
+      <w:pPr>
+        <w:spacing w:after="60" w:before="120"/>
+        <w:jc w:val="center"/>
+      </w:pPr>
+      <w:r>
+        <w:drawing>
+          <wp:inline distT="0" distB="0" distL="0" distR="0">
+            <wp:extent cx="5334000" cy="3448050"/>
+            <wp:effectExtent t="0" r="0" b="0" l="0"/>
+            <wp:docPr id="5" name=""/>
+            <wp:cNvGraphicFramePr>
+              <a:graphicFrameLocks xmlns:a="http://schemas.openxmlformats.org/drawingml/2006/main" noChangeAspect="1"/>
+            </wp:cNvGraphicFramePr>
+            <a:graphic xmlns:a="http://schemas.openxmlformats.org/drawingml/2006/main">
+              <a:graphicData uri="http://schemas.openxmlformats.org/drawingml/2006/picture">
+                <pic:pic xmlns:pic="http://schemas.openxmlformats.org/drawingml/2006/picture">
+                  <pic:nvPicPr>
+                    <pic:cNvPr id="0" name="" descr=""/>
+                    <pic:cNvPicPr>
+                      <a:picLocks noChangeAspect="1" noChangeArrowheads="1"/>
+                    </pic:cNvPicPr>
+                  </pic:nvPicPr>
+                  <pic:blipFill>
+                    <a:blip r:embed="rId11" cstate="none"/>
+                    <a:srcRect/>
+                    <a:stretch>
+                      <a:fillRect/>
+                    </a:stretch>
+                  </pic:blipFill>
+                  <pic:spPr bwMode="auto">
+                    <a:xfrm>
+                      <a:off x="0" y="0"/>
+                      <a:ext cx="5334000" cy="3448050"/>
+                    </a:xfrm>
+                    <a:prstGeom prst="rect">
+                      <a:avLst/>
+                    </a:prstGeom>
+                  </pic:spPr>
+                </pic:pic>
+              </a:graphicData>
+            </a:graphic>
+          </wp:inline>
+        </w:drawing>
+      </w:r>
+    </w:p>
+    <w:p>
+      <w:pPr>
+        <w:spacing w:after="160"/>
+        <w:jc w:val="center"/>
+      </w:pPr>
+      <w:r>
+        <w:rPr>
+          <w:rFonts w:ascii="Malgun Gothic" w:cs="Malgun Gothic" w:eastAsia="Malgun Gothic" w:hAnsi="Malgun Gothic"/>
+          <w:color w:val="555555"/>
+          <w:sz w:val="18"/>
+          <w:szCs w:val="18"/>
+        </w:rPr>
+        <w:t xml:space="preserve">그림 Ⅲ-3 OAK 방위각 검증 — 마스트 위, 벽 2.0 m, 주황선은 게이트 검출 높이 띠</w:t>
       </w:r>
     </w:p>
     <w:tbl>
@@ -17159,7 +17391,7 @@
           <wp:inline distT="0" distB="0" distL="0" distR="0">
             <wp:extent cx="5334000" cy="3495675"/>
             <wp:effectExtent t="0" r="0" b="0" l="0"/>
-            <wp:docPr id="4" name=""/>
+            <wp:docPr id="6" name=""/>
             <wp:cNvGraphicFramePr>
               <a:graphicFrameLocks xmlns:a="http://schemas.openxmlformats.org/drawingml/2006/main" noChangeAspect="1"/>
             </wp:cNvGraphicFramePr>
@@ -17173,7 +17405,7 @@
                     </pic:cNvPicPr>
                   </pic:nvPicPr>
                   <pic:blipFill>
-                    <a:blip r:embed="rId10" cstate="none"/>
+                    <a:blip r:embed="rId12" cstate="none"/>
                     <a:srcRect/>
                     <a:stretch>
                       <a:fillRect/>
@@ -17207,7 +17439,7 @@
           <w:sz w:val="18"/>
           <w:szCs w:val="18"/>
         </w:rPr>
-        <w:t xml:space="preserve">그림 Ⅲ-2 종합임무 상태기계</w:t>
+        <w:t xml:space="preserve">그림 Ⅲ-4 종합임무 상태기계</w:t>
       </w:r>
     </w:p>
     <w:p>
@@ -17284,19 +17516,6 @@
           <w:szCs w:val="20"/>
         </w:rPr>
         <w:t xml:space="preserve">거리는 LiDAR 전방 섹터 최소거리. 통과 수는 /gates_passed 로 기록.</w:t>
-      </w:r>
-    </w:p>
-    <w:p>
-      <w:pPr>
-        <w:spacing w:after="100" w:line="300"/>
-      </w:pPr>
-      <w:r>
-        <w:rPr>
-          <w:rFonts w:ascii="Malgun Gothic" w:cs="Malgun Gothic" w:eastAsia="Malgun Gothic" w:hAnsi="Malgun Gothic"/>
-          <w:sz w:val="20"/>
-          <w:szCs w:val="20"/>
-        </w:rPr>
-        <w:t xml:space="preserve">(상태 전이 그림, 실측 통과 성공률 — Ⅱ-5 표와 연결)</w:t>
       </w:r>
     </w:p>
     <w:p>
@@ -18506,7 +18725,7 @@
                 <w:sz w:val="20"/>
                 <w:szCs w:val="20"/>
               </w:rPr>
-              <w:t xml:space="preserve">실측 후 튜닝</w:t>
+              <w:t xml:space="preserve">한 주기(0.1 s) 조향각 변화 상한</w:t>
             </w:r>
           </w:p>
         </w:tc>
@@ -18535,7 +18754,7 @@
           <wp:inline distT="0" distB="0" distL="0" distR="0">
             <wp:extent cx="5334000" cy="3876675"/>
             <wp:effectExtent t="0" r="0" b="0" l="0"/>
-            <wp:docPr id="5" name=""/>
+            <wp:docPr id="7" name=""/>
             <wp:cNvGraphicFramePr>
               <a:graphicFrameLocks xmlns:a="http://schemas.openxmlformats.org/drawingml/2006/main" noChangeAspect="1"/>
             </wp:cNvGraphicFramePr>
@@ -18549,7 +18768,7 @@
                     </pic:cNvPicPr>
                   </pic:nvPicPr>
                   <pic:blipFill>
-                    <a:blip r:embed="rId11" cstate="none"/>
+                    <a:blip r:embed="rId13" cstate="none"/>
                     <a:srcRect/>
                     <a:stretch>
                       <a:fillRect/>
@@ -18583,7 +18802,7 @@
           <w:sz w:val="18"/>
           <w:szCs w:val="18"/>
         </w:rPr>
-        <w:t xml:space="preserve">그림 Ⅲ-3 갭 선택 개념도 — (a) 위에서 본 장면 (b) 이진 마스크 (c) 스파이크 제거 (d) 가장자리 정리 (e) 팽창 (f) 폭 판정과 목표 clamp. 가상 장면, 대회 파라미터 (tools/gap_selection_figure.py)</w:t>
+        <w:t xml:space="preserve">그림 Ⅲ-5 갭 선택 개념도 — (a) 위에서 본 장면 (b) 이진 마스크 (c) 스파이크 제거 (d) 가장자리 정리 (e) 팽창 (f) 폭 판정과 목표 clamp. 가상 장면, 대회 파라미터 (tools/gap_selection_figure.py)</w:t>
       </w:r>
     </w:p>
     <w:p>
@@ -18665,23 +18884,7 @@
           <w:sz w:val="20"/>
           <w:szCs w:val="20"/>
         </w:rPr>
-        <w:t xml:space="preserve">임계(원형도·extent·확인 프레임)는 감이 아니라 </w:t>
-      </w:r>
-      <w:r>
-        <w:rPr>
-          <w:rFonts w:ascii="Consolas" w:cs="Consolas" w:eastAsia="Consolas" w:hAnsi="Consolas"/>
-          <w:sz w:val="18"/>
-          <w:szCs w:val="18"/>
-        </w:rPr>
-        <w:t xml:space="preserve">tools/dock_eval.py</w:t>
-      </w:r>
-      <w:r>
-        <w:rPr>
-          <w:rFonts w:ascii="Malgun Gothic" w:cs="Malgun Gothic" w:eastAsia="Malgun Gothic" w:hAnsi="Malgun Gothic"/>
-          <w:sz w:val="20"/>
-          <w:szCs w:val="20"/>
-        </w:rPr>
-        <w:t xml:space="preserve"> 혼동행렬 수치로 정한다. 실외 캘리브레이션 대상 위험은 둘이다: </w:t>
+        <w:t xml:space="preserve">색 범위에서 헷갈리기 쉬운 곳은 둘이다: </w:t>
       </w:r>
       <w:r>
         <w:rPr>
@@ -18719,7 +18922,23 @@
           <w:sz w:val="20"/>
           <w:szCs w:val="20"/>
         </w:rPr>
-        <w:t xml:space="preserve">접안 거리는 LiDAR 전방 섹터 최소거리 → 도크 규격에 맞춰 contact_dist_m 으로 정한다.</w:t>
+        <w:t xml:space="preserve">접안 거리는 LiDAR 전방 섹터 최소거리로 판단한다(</w:t>
+      </w:r>
+      <w:r>
+        <w:rPr>
+          <w:rFonts w:ascii="Consolas" w:cs="Consolas" w:eastAsia="Consolas" w:hAnsi="Consolas"/>
+          <w:sz w:val="18"/>
+          <w:szCs w:val="18"/>
+        </w:rPr>
+        <w:t xml:space="preserve">contact_dist_m</w:t>
+      </w:r>
+      <w:r>
+        <w:rPr>
+          <w:rFonts w:ascii="Malgun Gothic" w:cs="Malgun Gothic" w:eastAsia="Malgun Gothic" w:hAnsi="Malgun Gothic"/>
+          <w:sz w:val="20"/>
+          <w:szCs w:val="20"/>
+        </w:rPr>
+        <w:t xml:space="preserve">).</w:t>
       </w:r>
     </w:p>
     <w:p>
@@ -19612,7 +19831,7 @@
           <w:sz w:val="20"/>
           <w:szCs w:val="20"/>
         </w:rPr>
-        <w:t xml:space="preserve">steer_invert 하나가 조향과 SPIN 을 함께 뒤집는다(배선 반대 대비). 물 위 첫 시험에서 확정한다(배선 반대가 가장 흔한 사고).</w:t>
+        <w:t xml:space="preserve">steer_invert 하나가 조향과 SPIN 을 함께 뒤집는다(배선 반대 대비).</w:t>
       </w:r>
     </w:p>
     <w:p>
@@ -21505,7 +21724,7 @@
           <w:sz w:val="20"/>
           <w:szCs w:val="20"/>
         </w:rPr>
-        <w:t xml:space="preserve">half_width 0.29 에서 clearance 별 접촉은 0.20 → 1.95, 0.25 → 1.32, 0.30 → 1.46(정체 2%), 0.35 → 정체 28%, 0.45 → 정체 50% 로, 접촉이 가장 적은 0.45 는 절반이 정체라 고르지 않았다. 작년 값 half_width 0.45 는 1.15 m 갭을 요구해 접촉 3.0 회·정체 1.5 회였다(1차 단일 시드 스윕). 최적점의 갭 요구(half_width×2 + clearance)는 0.78~0.90 m 에 모인다. 한계도 있다. 접촉 판정이 반경 half_width 원이라 측면 접촉을 못 잡고, 동역학은 가정값이며, 시간 투표·지오펜스 병합은 시뮬에 없다. 선회 중 유효 폭 W·cosθ + L·sinθ 는 1번배 치수(W 0.58, L 1.66)로 10° 에서 0.86 m, 15° 에서 0.99 m 라 갭 요구 0.83 m 는 약 9° 이내로 정렬했을 때만 맞는다 — 1 m 안팎 틈은 시뮬이 못 잡는 영역이라 수조 게이트 시험으로 확인한다.</w:t>
+        <w:t xml:space="preserve">half_width 0.29 에서 clearance 별 접촉은 0.20 → 1.95, 0.25 → 1.32, 0.30 → 1.46(정체 2%), 0.35 → 정체 28%, 0.45 → 정체 50% 로, 접촉이 가장 적은 0.45 는 절반이 정체라 고르지 않았다. 작년 값 half_width 0.45 는 1.15 m 갭을 요구해 접촉 3.0 회·정체 1.5 회였다(1차 단일 시드 스윕). 최적점의 갭 요구(half_width×2 + clearance)는 0.78~0.90 m 에 모인다. 한계도 있다. 접촉 판정이 반경 half_width 원이라 측면 접촉을 못 잡고, 동역학은 가정값이며, 시간 투표·지오펜스 병합은 시뮬에 없다. 선회 중 유효 폭 W·cosθ + L·sinθ 는 1번배 치수(W 0.58, L 1.66)로 10° 에서 0.86 m, 15° 에서 0.99 m 라 갭 요구 0.83 m 는 약 9° 이내로 정렬했을 때만 맞는다 — 1 m 안팎 틈은 시뮬이 못 잡는 영역이다.</w:t>
       </w:r>
     </w:p>
     <w:p>
@@ -22254,6 +22473,230 @@
                 <w:szCs w:val="20"/>
               </w:rPr>
               <w:t xml:space="preserve"> 95 개 전부 통과</w:t>
+            </w:r>
+          </w:p>
+        </w:tc>
+      </w:tr>
+      <w:tr>
+        <w:tc>
+          <w:tcPr>
+            <w:tcW w:type="dxa" w:w="1872"/>
+            <w:tcBorders>
+              <w:top w:val="single" w:color="000000" w:sz="6"/>
+              <w:left w:val="single" w:color="000000" w:sz="6"/>
+              <w:bottom w:val="single" w:color="000000" w:sz="6"/>
+              <w:right w:val="single" w:color="000000" w:sz="6"/>
+            </w:tcBorders>
+            <w:tcMar>
+              <w:top w:type="dxa" w:w="60"/>
+              <w:left w:type="dxa" w:w="90"/>
+              <w:bottom w:type="dxa" w:w="60"/>
+              <w:right w:type="dxa" w:w="90"/>
+            </w:tcMar>
+          </w:tcPr>
+          <w:p>
+            <w:r>
+              <w:rPr>
+                <w:rFonts w:ascii="Malgun Gothic" w:cs="Malgun Gothic" w:eastAsia="Malgun Gothic" w:hAnsi="Malgun Gothic"/>
+                <w:sz w:val="20"/>
+                <w:szCs w:val="20"/>
+              </w:rPr>
+              <w:t xml:space="preserve">OAK 연결·전송 (10-31, 1번배, 벤치 PoE 어댑터 10/100)</w:t>
+            </w:r>
+          </w:p>
+        </w:tc>
+        <w:tc>
+          <w:tcPr>
+            <w:tcW w:type="dxa" w:w="7488"/>
+            <w:tcBorders>
+              <w:top w:val="single" w:color="000000" w:sz="6"/>
+              <w:left w:val="single" w:color="000000" w:sz="6"/>
+              <w:bottom w:val="single" w:color="000000" w:sz="6"/>
+              <w:right w:val="single" w:color="000000" w:sz="6"/>
+            </w:tcBorders>
+            <w:tcMar>
+              <w:top w:type="dxa" w:w="60"/>
+              <w:left w:type="dxa" w:w="90"/>
+              <w:bottom w:type="dxa" w:w="60"/>
+              <w:right w:type="dxa" w:w="90"/>
+            </w:tcMar>
+          </w:tcPr>
+          <w:p>
+            <w:r>
+              <w:rPr>
+                <w:rFonts w:ascii="Malgun Gothic" w:cs="Malgun Gothic" w:eastAsia="Malgun Gothic" w:hAnsi="Malgun Gothic"/>
+                <w:sz w:val="20"/>
+                <w:szCs w:val="20"/>
+              </w:rPr>
+              <w:t xml:space="preserve">169.254.1.222 ping 손실 0 %, 드라이버 연결 13~17 s. 640×360 MJPEG 카메라 30 fps · 검출기 프로세스 수신 26 fps. 1280×720 비압축 8 fps(100 Mb 포화), 1280×720 MJPEG 은 카메라 30 fps 지만 수신 9 fps(프레임 2.7 MB, 노트북 내부 전달 병목) → 640×360 채택</w:t>
+            </w:r>
+          </w:p>
+        </w:tc>
+      </w:tr>
+      <w:tr>
+        <w:tc>
+          <w:tcPr>
+            <w:tcW w:type="dxa" w:w="1872"/>
+            <w:tcBorders>
+              <w:top w:val="single" w:color="000000" w:sz="6"/>
+              <w:left w:val="single" w:color="000000" w:sz="6"/>
+              <w:bottom w:val="single" w:color="000000" w:sz="6"/>
+              <w:right w:val="single" w:color="000000" w:sz="6"/>
+            </w:tcBorders>
+            <w:tcMar>
+              <w:top w:type="dxa" w:w="60"/>
+              <w:left w:type="dxa" w:w="90"/>
+              <w:bottom w:type="dxa" w:w="60"/>
+              <w:right w:type="dxa" w:w="90"/>
+            </w:tcMar>
+          </w:tcPr>
+          <w:p>
+            <w:r>
+              <w:rPr>
+                <w:rFonts w:ascii="Malgun Gothic" w:cs="Malgun Gothic" w:eastAsia="Malgun Gothic" w:hAnsi="Malgun Gothic"/>
+                <w:sz w:val="20"/>
+                <w:szCs w:val="20"/>
+              </w:rPr>
+              <w:t xml:space="preserve">센서 전부 + OAK 10분 연속 (10-31, 1번배)</w:t>
+            </w:r>
+          </w:p>
+        </w:tc>
+        <w:tc>
+          <w:tcPr>
+            <w:tcW w:type="dxa" w:w="7488"/>
+            <w:tcBorders>
+              <w:top w:val="single" w:color="000000" w:sz="6"/>
+              <w:left w:val="single" w:color="000000" w:sz="6"/>
+              <w:bottom w:val="single" w:color="000000" w:sz="6"/>
+              <w:right w:val="single" w:color="000000" w:sz="6"/>
+            </w:tcBorders>
+            <w:tcMar>
+              <w:top w:type="dxa" w:w="60"/>
+              <w:left w:type="dxa" w:w="90"/>
+              <w:bottom w:type="dxa" w:w="60"/>
+              <w:right w:type="dxa" w:w="90"/>
+            </w:tcMar>
+          </w:tcPr>
+          <w:p>
+            <w:r>
+              <w:rPr>
+                <w:rFonts w:ascii="Malgun Gothic" w:cs="Malgun Gothic" w:eastAsia="Malgun Gothic" w:hAnsi="Malgun Gothic"/>
+                <w:sz w:val="20"/>
+                <w:szCs w:val="20"/>
+              </w:rPr>
+              <w:t xml:space="preserve">LiDAR·IMU·GPS·D455·OAK·검출기 3종·healthcheck 동시: OAK 30.0 fps, D455 29.97 fps, LiDAR 11.2 Hz, IMU 100 Hz, GPS 1 Hz, 게이트 검출 29.5 fps(최대 간격 0.33 s). 커널 USB 끊김 0, 노드 사망 0, CPU 여유 83 %</w:t>
+            </w:r>
+          </w:p>
+        </w:tc>
+      </w:tr>
+      <w:tr>
+        <w:tc>
+          <w:tcPr>
+            <w:tcW w:type="dxa" w:w="1872"/>
+            <w:tcBorders>
+              <w:top w:val="single" w:color="000000" w:sz="6"/>
+              <w:left w:val="single" w:color="000000" w:sz="6"/>
+              <w:bottom w:val="single" w:color="000000" w:sz="6"/>
+              <w:right w:val="single" w:color="000000" w:sz="6"/>
+            </w:tcBorders>
+            <w:tcMar>
+              <w:top w:type="dxa" w:w="60"/>
+              <w:left w:type="dxa" w:w="90"/>
+              <w:bottom w:type="dxa" w:w="60"/>
+              <w:right w:type="dxa" w:w="90"/>
+            </w:tcMar>
+          </w:tcPr>
+          <w:p>
+            <w:r>
+              <w:rPr>
+                <w:rFonts w:ascii="Malgun Gothic" w:cs="Malgun Gothic" w:eastAsia="Malgun Gothic" w:hAnsi="Malgun Gothic"/>
+                <w:sz w:val="20"/>
+                <w:szCs w:val="20"/>
+              </w:rPr>
+              <w:t xml:space="preserve">OAK 드라이버 재시작 (10-31)</w:t>
+            </w:r>
+          </w:p>
+        </w:tc>
+        <w:tc>
+          <w:tcPr>
+            <w:tcW w:type="dxa" w:w="7488"/>
+            <w:tcBorders>
+              <w:top w:val="single" w:color="000000" w:sz="6"/>
+              <w:left w:val="single" w:color="000000" w:sz="6"/>
+              <w:bottom w:val="single" w:color="000000" w:sz="6"/>
+              <w:right w:val="single" w:color="000000" w:sz="6"/>
+            </w:tcBorders>
+            <w:tcMar>
+              <w:top w:type="dxa" w:w="60"/>
+              <w:left w:type="dxa" w:w="90"/>
+              <w:bottom w:type="dxa" w:w="60"/>
+              <w:right w:type="dxa" w:w="90"/>
+            </w:tcMar>
+          </w:tcPr>
+          <w:p>
+            <w:r>
+              <w:rPr>
+                <w:rFonts w:ascii="Malgun Gothic" w:cs="Malgun Gothic" w:eastAsia="Malgun Gothic" w:hAnsi="Malgun Gothic"/>
+                <w:sz w:val="20"/>
+                <w:szCs w:val="20"/>
+              </w:rPr>
+              <w:t xml:space="preserve">정상 종료 후 재시작 14~17 s 에 방위각 복구. 강제 종료(드라이버 사망) 후에는 카메라가 옛 연결을 붙잡아 85~90 s 재연결 불가 — 경기 중 드라이버가 죽으면 약 1.5 분 비전 공백</w:t>
+            </w:r>
+          </w:p>
+        </w:tc>
+      </w:tr>
+      <w:tr>
+        <w:tc>
+          <w:tcPr>
+            <w:tcW w:type="dxa" w:w="1872"/>
+            <w:tcBorders>
+              <w:top w:val="single" w:color="000000" w:sz="6"/>
+              <w:left w:val="single" w:color="000000" w:sz="6"/>
+              <w:bottom w:val="single" w:color="000000" w:sz="6"/>
+              <w:right w:val="single" w:color="000000" w:sz="6"/>
+            </w:tcBorders>
+            <w:tcMar>
+              <w:top w:type="dxa" w:w="60"/>
+              <w:left w:type="dxa" w:w="90"/>
+              <w:bottom w:type="dxa" w:w="60"/>
+              <w:right w:type="dxa" w:w="90"/>
+            </w:tcMar>
+          </w:tcPr>
+          <w:p>
+            <w:r>
+              <w:rPr>
+                <w:rFonts w:ascii="Malgun Gothic" w:cs="Malgun Gothic" w:eastAsia="Malgun Gothic" w:hAnsi="Malgun Gothic"/>
+                <w:sz w:val="20"/>
+                <w:szCs w:val="20"/>
+              </w:rPr>
+              <w:t xml:space="preserve">OAK 화각·방위각 (10-31, 1번배)</w:t>
+            </w:r>
+          </w:p>
+        </w:tc>
+        <w:tc>
+          <w:tcPr>
+            <w:tcW w:type="dxa" w:w="7488"/>
+            <w:tcBorders>
+              <w:top w:val="single" w:color="000000" w:sz="6"/>
+              <w:left w:val="single" w:color="000000" w:sz="6"/>
+              <w:bottom w:val="single" w:color="000000" w:sz="6"/>
+              <w:right w:val="single" w:color="000000" w:sz="6"/>
+            </w:tcBorders>
+            <w:tcMar>
+              <w:top w:type="dxa" w:w="60"/>
+              <w:left w:type="dxa" w:w="90"/>
+              <w:bottom w:type="dxa" w:w="60"/>
+              <w:right w:type="dxa" w:w="90"/>
+            </w:tcMar>
+          </w:tcPr>
+          <w:p>
+            <w:r>
+              <w:rPr>
+                <w:rFonts w:ascii="Malgun Gothic" w:cs="Malgun Gothic" w:eastAsia="Malgun Gothic" w:hAnsi="Malgun Gothic"/>
+                <w:sz w:val="20"/>
+                <w:szCs w:val="20"/>
+              </w:rPr>
+              <w:t xml:space="preserve">화각 63.9°(camera_info 63.87°), 방위각 정중앙 +1.34° · 왼쪽 1.00 m +26.99°(기대 +27.63°) · 왼쪽 끝 +28.91°(기대 +29.83°) — 그림 Ⅲ-2·Ⅲ-3</w:t>
             </w:r>
           </w:p>
         </w:tc>
@@ -22896,7 +23339,7 @@
           <wp:inline distT="0" distB="0" distL="0" distR="0">
             <wp:extent cx="4133850" cy="7239000"/>
             <wp:effectExtent t="0" r="0" b="0" l="0"/>
-            <wp:docPr id="6" name=""/>
+            <wp:docPr id="8" name=""/>
             <wp:cNvGraphicFramePr>
               <a:graphicFrameLocks xmlns:a="http://schemas.openxmlformats.org/drawingml/2006/main" noChangeAspect="1"/>
             </wp:cNvGraphicFramePr>
@@ -22910,7 +23353,7 @@
                     </pic:cNvPicPr>
                   </pic:nvPicPr>
                   <pic:blipFill>
-                    <a:blip r:embed="rId12" cstate="none"/>
+                    <a:blip r:embed="rId14" cstate="none"/>
                     <a:srcRect/>
                     <a:stretch>
                       <a:fillRect/>
@@ -24418,7 +24861,7 @@
           <wp:inline distT="0" distB="0" distL="0" distR="0">
             <wp:extent cx="5334000" cy="1847850"/>
             <wp:effectExtent t="0" r="0" b="0" l="0"/>
-            <wp:docPr id="7" name=""/>
+            <wp:docPr id="9" name=""/>
             <wp:cNvGraphicFramePr>
               <a:graphicFrameLocks xmlns:a="http://schemas.openxmlformats.org/drawingml/2006/main" noChangeAspect="1"/>
             </wp:cNvGraphicFramePr>
@@ -24432,7 +24875,7 @@
                     </pic:cNvPicPr>
                   </pic:nvPicPr>
                   <pic:blipFill>
-                    <a:blip r:embed="rId13" cstate="none"/>
+                    <a:blip r:embed="rId15" cstate="none"/>
                     <a:srcRect/>
                     <a:stretch>
                       <a:fillRect/>

</xml_diff>